<commit_message>
Rewrite manuscript DOCX with 27 equations embedded as live Word objects
Replace the simplified plain-text equation renderings in the manuscript
with native, editable OMML (Office Math) equation objects (Eqs. 1-27),
each centered with a right-aligned (n) label. The builder now imports the
OMML equation set from create_equations_docx.py and declares the math
namespace. Figures (19), tables (6), and all prose are preserved.
</commit_message>
<xml_diff>
--- a/Manuscript_ML_Hybrid_Nanofluid_Radiator.docx
+++ b/Manuscript_ML_Hybrid_Nanofluid_Radiator.docx
@@ -1,6 +1,6 @@
 
 <file path=word/document.xml><?xml version="1.0" encoding="utf-8"?>
-<w:document xmlns:w="http://schemas.openxmlformats.org/wordprocessingml/2006/main" xmlns:r="http://schemas.openxmlformats.org/officeDocument/2006/relationships" xmlns:wp="http://schemas.openxmlformats.org/drawingml/2006/wordprocessingDrawing" xmlns:a="http://schemas.openxmlformats.org/drawingml/2006/main" xmlns:pic="http://schemas.openxmlformats.org/drawingml/2006/picture">
+<w:document xmlns:w="http://schemas.openxmlformats.org/wordprocessingml/2006/main" xmlns:r="http://schemas.openxmlformats.org/officeDocument/2006/relationships" xmlns:wp="http://schemas.openxmlformats.org/drawingml/2006/wordprocessingDrawing" xmlns:a="http://schemas.openxmlformats.org/drawingml/2006/main" xmlns:pic="http://schemas.openxmlformats.org/drawingml/2006/picture" xmlns:m="http://schemas.openxmlformats.org/officeDocument/2006/math">
   <w:body>
     <w:p>
       <w:pPr>
@@ -2031,66 +2031,440 @@
     <w:p>
       <w:pPr>
         <w:jc w:val="center"/>
-      </w:pPr>
-      <w:r>
+        <w:tabs>
+          <w:tab w:val="right" w:pos="9360"/>
+        </w:tabs>
+      </w:pPr>
+      <m:oMath>
+        <m:sSub>
+          <m:sSubPr/>
+          <m:e>
+            <m:r>
+              <m:t>ρ</m:t>
+            </m:r>
+          </m:e>
+          <m:sub>
+            <m:r>
+              <m:t>nf</m:t>
+            </m:r>
+          </m:sub>
+        </m:sSub>
+        <m:r>
+          <m:t>=</m:t>
+        </m:r>
+        <m:sSub>
+          <m:sSubPr/>
+          <m:e>
+            <m:r>
+              <m:t>φρ</m:t>
+            </m:r>
+          </m:e>
+          <m:sub>
+            <m:r>
+              <m:t>p</m:t>
+            </m:r>
+          </m:sub>
+        </m:sSub>
+        <m:r>
+          <m:t>+(1−φ)</m:t>
+        </m:r>
+        <m:sSub>
+          <m:sSubPr/>
+          <m:e>
+            <m:r>
+              <m:t>ρ</m:t>
+            </m:r>
+          </m:e>
+          <m:sub>
+            <m:r>
+              <m:t>w</m:t>
+            </m:r>
+          </m:sub>
+        </m:sSub>
+      </m:oMath>
+      <w:r>
+        <w:tab/>
         <w:rPr>
-          <w:i/>
           <w:sz w:val="22"/>
-          <w:szCs w:val="22"/>
         </w:rPr>
-        <w:t xml:space="preserve">rho_nf = phi rho_p + (1-phi) rho_w      (1)</w:t>
+        <w:t xml:space="preserve">(1)</w:t>
       </w:r>
     </w:p>
     <w:p>
       <w:pPr>
         <w:jc w:val="center"/>
-      </w:pPr>
-      <w:r>
+        <w:tabs>
+          <w:tab w:val="right" w:pos="9360"/>
+        </w:tabs>
+      </w:pPr>
+      <m:oMath>
+        <m:sSub>
+          <m:sSubPr/>
+          <m:e>
+            <m:r>
+              <m:t>(ρcₚ)</m:t>
+            </m:r>
+          </m:e>
+          <m:sub>
+            <m:r>
+              <m:t>nf</m:t>
+            </m:r>
+          </m:sub>
+        </m:sSub>
+        <m:r>
+          <m:t>=</m:t>
+        </m:r>
+        <m:r>
+          <m:t>φ</m:t>
+        </m:r>
+        <m:sSub>
+          <m:sSubPr/>
+          <m:e>
+            <m:r>
+              <m:t>(ρcₚ)</m:t>
+            </m:r>
+          </m:e>
+          <m:sub>
+            <m:r>
+              <m:t>p</m:t>
+            </m:r>
+          </m:sub>
+        </m:sSub>
+        <m:r>
+          <m:t>+(1−φ)</m:t>
+        </m:r>
+        <m:sSub>
+          <m:sSubPr/>
+          <m:e>
+            <m:r>
+              <m:t>(ρcₚ)</m:t>
+            </m:r>
+          </m:e>
+          <m:sub>
+            <m:r>
+              <m:t>w</m:t>
+            </m:r>
+          </m:sub>
+        </m:sSub>
+      </m:oMath>
+      <w:r>
+        <w:tab/>
         <w:rPr>
-          <w:i/>
           <w:sz w:val="22"/>
-          <w:szCs w:val="22"/>
         </w:rPr>
-        <w:t xml:space="preserve">(rho c_p)_nf = phi (rho c_p)_p + (1-phi) (rho c_p)_w      (2)</w:t>
+        <w:t xml:space="preserve">(2)</w:t>
       </w:r>
     </w:p>
     <w:p>
       <w:pPr>
         <w:jc w:val="center"/>
-      </w:pPr>
-      <w:r>
+        <w:tabs>
+          <w:tab w:val="right" w:pos="9360"/>
+        </w:tabs>
+      </w:pPr>
+      <m:oMath>
+        <m:sSub>
+          <m:sSubPr/>
+          <m:e>
+            <m:r>
+              <m:t>c</m:t>
+            </m:r>
+          </m:e>
+          <m:sub>
+            <m:r>
+              <m:t>p,nf</m:t>
+            </m:r>
+          </m:sub>
+        </m:sSub>
+        <m:r>
+          <m:t>=</m:t>
+        </m:r>
+        <m:f>
+          <m:fPr/>
+          <m:num>
+            <m:r>
+              <m:t>φ</m:t>
+            </m:r>
+            <m:sSub>
+              <m:sSubPr/>
+              <m:e>
+                <m:r>
+                  <m:t>(ρcₚ)</m:t>
+                </m:r>
+              </m:e>
+              <m:sub>
+                <m:r>
+                  <m:t>p</m:t>
+                </m:r>
+              </m:sub>
+            </m:sSub>
+            <m:r>
+              <m:t>+(1−φ)</m:t>
+            </m:r>
+            <m:sSub>
+              <m:sSubPr/>
+              <m:e>
+                <m:r>
+                  <m:t>(ρcₚ)</m:t>
+                </m:r>
+              </m:e>
+              <m:sub>
+                <m:r>
+                  <m:t>w</m:t>
+                </m:r>
+              </m:sub>
+            </m:sSub>
+          </m:num>
+          <m:den>
+            <m:sSub>
+              <m:sSubPr/>
+              <m:e>
+                <m:r>
+                  <m:t>ρ</m:t>
+                </m:r>
+              </m:e>
+              <m:sub>
+                <m:r>
+                  <m:t>nf</m:t>
+                </m:r>
+              </m:sub>
+            </m:sSub>
+          </m:den>
+        </m:f>
+      </m:oMath>
+      <w:r>
+        <w:tab/>
         <w:rPr>
-          <w:i/>
           <w:sz w:val="22"/>
-          <w:szCs w:val="22"/>
         </w:rPr>
-        <w:t xml:space="preserve">c_p,nf = fracphi (rho c_p)_p + (1-phi) (rho c_p)_wrho_nf      (3)</w:t>
+        <w:t xml:space="preserve">(3)</w:t>
       </w:r>
     </w:p>
     <w:p>
       <w:pPr>
         <w:jc w:val="center"/>
-      </w:pPr>
-      <w:r>
+        <w:tabs>
+          <w:tab w:val="right" w:pos="9360"/>
+        </w:tabs>
+      </w:pPr>
+      <m:oMath>
+        <m:sSub>
+          <m:sSubPr/>
+          <m:e>
+            <m:r>
+              <m:t>μ</m:t>
+            </m:r>
+          </m:e>
+          <m:sub>
+            <m:r>
+              <m:t>nf</m:t>
+            </m:r>
+          </m:sub>
+        </m:sSub>
+        <m:r>
+          <m:t>=(1+2.5φ)</m:t>
+        </m:r>
+        <m:sSub>
+          <m:sSubPr/>
+          <m:e>
+            <m:r>
+              <m:t>μ</m:t>
+            </m:r>
+          </m:e>
+          <m:sub>
+            <m:r>
+              <m:t>w</m:t>
+            </m:r>
+          </m:sub>
+        </m:sSub>
+      </m:oMath>
+      <w:r>
+        <w:tab/>
         <w:rPr>
-          <w:i/>
           <w:sz w:val="22"/>
-          <w:szCs w:val="22"/>
         </w:rPr>
-        <w:t xml:space="preserve">mu_nf = (1 + 2.5 phi) mu_w      (4)</w:t>
+        <w:t xml:space="preserve">(4)</w:t>
       </w:r>
     </w:p>
     <w:p>
       <w:pPr>
         <w:jc w:val="center"/>
-      </w:pPr>
-      <w:r>
+        <w:tabs>
+          <w:tab w:val="right" w:pos="9360"/>
+        </w:tabs>
+      </w:pPr>
+      <m:oMath>
+        <m:sSub>
+          <m:sSubPr/>
+          <m:e>
+            <m:r>
+              <m:t>k</m:t>
+            </m:r>
+          </m:e>
+          <m:sub>
+            <m:r>
+              <m:t>nf</m:t>
+            </m:r>
+          </m:sub>
+        </m:sSub>
+        <m:r>
+          <m:t>=</m:t>
+        </m:r>
+        <m:f>
+          <m:fPr/>
+          <m:num>
+            <m:sSub>
+              <m:sSubPr/>
+              <m:e>
+                <m:r>
+                  <m:t>k</m:t>
+                </m:r>
+              </m:e>
+              <m:sub>
+                <m:r>
+                  <m:t>p</m:t>
+                </m:r>
+              </m:sub>
+            </m:sSub>
+            <m:r>
+              <m:t>+2</m:t>
+            </m:r>
+            <m:sSub>
+              <m:sSubPr/>
+              <m:e>
+                <m:r>
+                  <m:t>k</m:t>
+                </m:r>
+              </m:e>
+              <m:sub>
+                <m:r>
+                  <m:t>w</m:t>
+                </m:r>
+              </m:sub>
+            </m:sSub>
+            <m:r>
+              <m:t>−2φ(</m:t>
+            </m:r>
+            <m:sSub>
+              <m:sSubPr/>
+              <m:e>
+                <m:r>
+                  <m:t>k</m:t>
+                </m:r>
+              </m:e>
+              <m:sub>
+                <m:r>
+                  <m:t>w</m:t>
+                </m:r>
+              </m:sub>
+            </m:sSub>
+            <m:r>
+              <m:t>−</m:t>
+            </m:r>
+            <m:sSub>
+              <m:sSubPr/>
+              <m:e>
+                <m:r>
+                  <m:t>k</m:t>
+                </m:r>
+              </m:e>
+              <m:sub>
+                <m:r>
+                  <m:t>p</m:t>
+                </m:r>
+              </m:sub>
+            </m:sSub>
+            <m:r>
+              <m:t>)</m:t>
+            </m:r>
+          </m:num>
+          <m:den>
+            <m:sSub>
+              <m:sSubPr/>
+              <m:e>
+                <m:r>
+                  <m:t>k</m:t>
+                </m:r>
+              </m:e>
+              <m:sub>
+                <m:r>
+                  <m:t>p</m:t>
+                </m:r>
+              </m:sub>
+            </m:sSub>
+            <m:r>
+              <m:t>+2</m:t>
+            </m:r>
+            <m:sSub>
+              <m:sSubPr/>
+              <m:e>
+                <m:r>
+                  <m:t>k</m:t>
+                </m:r>
+              </m:e>
+              <m:sub>
+                <m:r>
+                  <m:t>w</m:t>
+                </m:r>
+              </m:sub>
+            </m:sSub>
+            <m:r>
+              <m:t>+φ(</m:t>
+            </m:r>
+            <m:sSub>
+              <m:sSubPr/>
+              <m:e>
+                <m:r>
+                  <m:t>k</m:t>
+                </m:r>
+              </m:e>
+              <m:sub>
+                <m:r>
+                  <m:t>w</m:t>
+                </m:r>
+              </m:sub>
+            </m:sSub>
+            <m:r>
+              <m:t>−</m:t>
+            </m:r>
+            <m:sSub>
+              <m:sSubPr/>
+              <m:e>
+                <m:r>
+                  <m:t>k</m:t>
+                </m:r>
+              </m:e>
+              <m:sub>
+                <m:r>
+                  <m:t>p</m:t>
+                </m:r>
+              </m:sub>
+            </m:sSub>
+            <m:r>
+              <m:t>)</m:t>
+            </m:r>
+          </m:den>
+        </m:f>
+        <m:sSub>
+          <m:sSubPr/>
+          <m:e>
+            <m:r>
+              <m:t>k</m:t>
+            </m:r>
+          </m:e>
+          <m:sub>
+            <m:r>
+              <m:t>w</m:t>
+            </m:r>
+          </m:sub>
+        </m:sSub>
+      </m:oMath>
+      <w:r>
+        <w:tab/>
         <w:rPr>
-          <w:i/>
           <w:sz w:val="22"/>
-          <w:szCs w:val="22"/>
         </w:rPr>
-        <w:t xml:space="preserve">k_nf = (k_p + 2k_w - 2phi (k_w - k_p))/(k_p + 2k_w + phi (k_w - k_p))  k_w      (5)</w:t>
+        <w:t xml:space="preserve">(5)</w:t>
       </w:r>
     </w:p>
     <w:p>
@@ -2101,40 +2475,187 @@
     <w:p>
       <w:pPr>
         <w:jc w:val="center"/>
-      </w:pPr>
-      <w:r>
+        <w:tabs>
+          <w:tab w:val="right" w:pos="9360"/>
+        </w:tabs>
+      </w:pPr>
+      <m:oMath>
+        <m:sSub>
+          <m:sSubPr/>
+          <m:e>
+            <m:r>
+              <m:t>ρ</m:t>
+            </m:r>
+          </m:e>
+          <m:sub>
+            <m:r>
+              <m:t>p</m:t>
+            </m:r>
+          </m:sub>
+        </m:sSub>
+        <m:r>
+          <m:t>=x</m:t>
+        </m:r>
+        <m:sSub>
+          <m:sSubPr/>
+          <m:e>
+            <m:r>
+              <m:t>ρ</m:t>
+            </m:r>
+          </m:e>
+          <m:sub>
+            <m:r>
+              <m:t>Al₂O₃</m:t>
+            </m:r>
+          </m:sub>
+        </m:sSub>
+        <m:r>
+          <m:t>+(1−x)</m:t>
+        </m:r>
+        <m:sSub>
+          <m:sSubPr/>
+          <m:e>
+            <m:r>
+              <m:t>ρ</m:t>
+            </m:r>
+          </m:e>
+          <m:sub>
+            <m:r>
+              <m:t>CuO</m:t>
+            </m:r>
+          </m:sub>
+        </m:sSub>
+      </m:oMath>
+      <w:r>
+        <w:tab/>
         <w:rPr>
-          <w:i/>
           <w:sz w:val="22"/>
-          <w:szCs w:val="22"/>
         </w:rPr>
-        <w:t xml:space="preserve">rho_p = x rho_Al_2O_3 + (1-x) rho_CuO      (6)</w:t>
+        <w:t xml:space="preserve">(6)</w:t>
       </w:r>
     </w:p>
     <w:p>
       <w:pPr>
         <w:jc w:val="center"/>
-      </w:pPr>
-      <w:r>
+        <w:tabs>
+          <w:tab w:val="right" w:pos="9360"/>
+        </w:tabs>
+      </w:pPr>
+      <m:oMath>
+        <m:sSub>
+          <m:sSubPr/>
+          <m:e>
+            <m:r>
+              <m:t>(ρcₚ)</m:t>
+            </m:r>
+          </m:e>
+          <m:sub>
+            <m:r>
+              <m:t>p</m:t>
+            </m:r>
+          </m:sub>
+        </m:sSub>
+        <m:r>
+          <m:t>=x</m:t>
+        </m:r>
+        <m:sSub>
+          <m:sSubPr/>
+          <m:e>
+            <m:r>
+              <m:t>(ρcₚ)</m:t>
+            </m:r>
+          </m:e>
+          <m:sub>
+            <m:r>
+              <m:t>Al₂O₃</m:t>
+            </m:r>
+          </m:sub>
+        </m:sSub>
+        <m:r>
+          <m:t>+(1−x)</m:t>
+        </m:r>
+        <m:sSub>
+          <m:sSubPr/>
+          <m:e>
+            <m:r>
+              <m:t>(ρcₚ)</m:t>
+            </m:r>
+          </m:e>
+          <m:sub>
+            <m:r>
+              <m:t>CuO</m:t>
+            </m:r>
+          </m:sub>
+        </m:sSub>
+      </m:oMath>
+      <w:r>
+        <w:tab/>
         <w:rPr>
-          <w:i/>
           <w:sz w:val="22"/>
-          <w:szCs w:val="22"/>
         </w:rPr>
-        <w:t xml:space="preserve">(rho c_p)_p = x (rho c_p)_Al_2O_3 + (1-x) (rho c_p)_CuO      (7)</w:t>
+        <w:t xml:space="preserve">(7)</w:t>
       </w:r>
     </w:p>
     <w:p>
       <w:pPr>
         <w:jc w:val="center"/>
-      </w:pPr>
-      <w:r>
+        <w:tabs>
+          <w:tab w:val="right" w:pos="9360"/>
+        </w:tabs>
+      </w:pPr>
+      <m:oMath>
+        <m:sSub>
+          <m:sSubPr/>
+          <m:e>
+            <m:r>
+              <m:t>k</m:t>
+            </m:r>
+          </m:e>
+          <m:sub>
+            <m:r>
+              <m:t>p</m:t>
+            </m:r>
+          </m:sub>
+        </m:sSub>
+        <m:r>
+          <m:t>=x</m:t>
+        </m:r>
+        <m:sSub>
+          <m:sSubPr/>
+          <m:e>
+            <m:r>
+              <m:t>k</m:t>
+            </m:r>
+          </m:e>
+          <m:sub>
+            <m:r>
+              <m:t>Al₂O₃</m:t>
+            </m:r>
+          </m:sub>
+        </m:sSub>
+        <m:r>
+          <m:t>+(1−x)</m:t>
+        </m:r>
+        <m:sSub>
+          <m:sSubPr/>
+          <m:e>
+            <m:r>
+              <m:t>k</m:t>
+            </m:r>
+          </m:e>
+          <m:sub>
+            <m:r>
+              <m:t>CuO</m:t>
+            </m:r>
+          </m:sub>
+        </m:sSub>
+      </m:oMath>
+      <w:r>
+        <w:tab/>
         <w:rPr>
-          <w:i/>
           <w:sz w:val="22"/>
-          <w:szCs w:val="22"/>
         </w:rPr>
-        <w:t xml:space="preserve">k_p = x k_Al_2O_3 + (1-x) k_CuO      (8)</w:t>
+        <w:t xml:space="preserve">(8)</w:t>
       </w:r>
     </w:p>
     <w:p>
@@ -2145,53 +2666,268 @@
     <w:p>
       <w:pPr>
         <w:jc w:val="center"/>
-      </w:pPr>
-      <w:r>
+        <w:tabs>
+          <w:tab w:val="right" w:pos="9360"/>
+        </w:tabs>
+      </w:pPr>
+      <m:oMath>
+        <m:r>
+          <m:t>U=</m:t>
+        </m:r>
+        <m:f>
+          <m:fPr/>
+          <m:num>
+            <m:sSub>
+              <m:sSubPr/>
+              <m:e>
+                <m:acc>
+                  <m:accPr>
+                    <m:chr m:val="̇"/>
+                  </m:accPr>
+                  <m:e>
+                    <m:r>
+                      <m:t>m</m:t>
+                    </m:r>
+                  </m:e>
+                </m:acc>
+              </m:e>
+              <m:sub>
+                <m:r>
+                  <m:t>nf</m:t>
+                </m:r>
+              </m:sub>
+            </m:sSub>
+          </m:num>
+          <m:den>
+            <m:sSub>
+              <m:sSubPr/>
+              <m:e>
+                <m:r>
+                  <m:t>ρ</m:t>
+                </m:r>
+              </m:e>
+              <m:sub>
+                <m:r>
+                  <m:t>nf</m:t>
+                </m:r>
+              </m:sub>
+            </m:sSub>
+            <m:sSub>
+              <m:sSubPr/>
+              <m:e>
+                <m:r>
+                  <m:t>A</m:t>
+                </m:r>
+              </m:e>
+              <m:sub>
+                <m:r>
+                  <m:t>c</m:t>
+                </m:r>
+              </m:sub>
+            </m:sSub>
+          </m:den>
+        </m:f>
+      </m:oMath>
+      <w:r>
+        <w:tab/>
         <w:rPr>
-          <w:i/>
           <w:sz w:val="22"/>
-          <w:szCs w:val="22"/>
         </w:rPr>
-        <w:t xml:space="preserve">U = fracm_dot_nfrho_nf A_c      (9)</w:t>
+        <w:t xml:space="preserve">(9)</w:t>
       </w:r>
     </w:p>
     <w:p>
       <w:pPr>
         <w:jc w:val="center"/>
-      </w:pPr>
-      <w:r>
+        <w:tabs>
+          <w:tab w:val="right" w:pos="9360"/>
+        </w:tabs>
+      </w:pPr>
+      <m:oMath>
+        <m:sSub>
+          <m:sSubPr/>
+          <m:e>
+            <m:r>
+              <m:t>D</m:t>
+            </m:r>
+          </m:e>
+          <m:sub>
+            <m:r>
+              <m:t>h</m:t>
+            </m:r>
+          </m:sub>
+        </m:sSub>
+        <m:r>
+          <m:t>=</m:t>
+        </m:r>
+        <m:f>
+          <m:fPr/>
+          <m:num>
+            <m:r>
+              <m:t>4</m:t>
+            </m:r>
+            <m:sSub>
+              <m:sSubPr/>
+              <m:e>
+                <m:r>
+                  <m:t>A</m:t>
+                </m:r>
+              </m:e>
+              <m:sub>
+                <m:r>
+                  <m:t>c</m:t>
+                </m:r>
+              </m:sub>
+            </m:sSub>
+          </m:num>
+          <m:den>
+            <m:r>
+              <m:t>P</m:t>
+            </m:r>
+          </m:den>
+        </m:f>
+      </m:oMath>
+      <w:r>
+        <w:tab/>
         <w:rPr>
-          <w:i/>
           <w:sz w:val="22"/>
-          <w:szCs w:val="22"/>
         </w:rPr>
-        <w:t xml:space="preserve">D_h = (4 A_c)/(P)      (10)</w:t>
+        <w:t xml:space="preserve">(10)</w:t>
       </w:r>
     </w:p>
     <w:p>
       <w:pPr>
         <w:jc w:val="center"/>
-      </w:pPr>
-      <w:r>
+        <w:tabs>
+          <w:tab w:val="right" w:pos="9360"/>
+        </w:tabs>
+      </w:pPr>
+      <m:oMath>
+        <m:r>
+          <m:t>Re=</m:t>
+        </m:r>
+        <m:f>
+          <m:fPr/>
+          <m:num>
+            <m:sSub>
+              <m:sSubPr/>
+              <m:e>
+                <m:r>
+                  <m:t>ρ</m:t>
+                </m:r>
+              </m:e>
+              <m:sub>
+                <m:r>
+                  <m:t>nf</m:t>
+                </m:r>
+              </m:sub>
+            </m:sSub>
+            <m:r>
+              <m:t>U</m:t>
+            </m:r>
+            <m:sSub>
+              <m:sSubPr/>
+              <m:e>
+                <m:r>
+                  <m:t>D</m:t>
+                </m:r>
+              </m:e>
+              <m:sub>
+                <m:r>
+                  <m:t>h</m:t>
+                </m:r>
+              </m:sub>
+            </m:sSub>
+          </m:num>
+          <m:den>
+            <m:sSub>
+              <m:sSubPr/>
+              <m:e>
+                <m:r>
+                  <m:t>μ</m:t>
+                </m:r>
+              </m:e>
+              <m:sub>
+                <m:r>
+                  <m:t>nf</m:t>
+                </m:r>
+              </m:sub>
+            </m:sSub>
+          </m:den>
+        </m:f>
+      </m:oMath>
+      <w:r>
+        <w:tab/>
         <w:rPr>
-          <w:i/>
           <w:sz w:val="22"/>
-          <w:szCs w:val="22"/>
         </w:rPr>
-        <w:t xml:space="preserve">Re = fracrho_nf U D_hmu_nf      (11)</w:t>
+        <w:t xml:space="preserve">(11)</w:t>
       </w:r>
     </w:p>
     <w:p>
       <w:pPr>
         <w:jc w:val="center"/>
-      </w:pPr>
-      <w:r>
+        <w:tabs>
+          <w:tab w:val="right" w:pos="9360"/>
+        </w:tabs>
+      </w:pPr>
+      <m:oMath>
+        <m:r>
+          <m:t>Pr=</m:t>
+        </m:r>
+        <m:f>
+          <m:fPr/>
+          <m:num>
+            <m:sSub>
+              <m:sSubPr/>
+              <m:e>
+                <m:r>
+                  <m:t>μ</m:t>
+                </m:r>
+              </m:e>
+              <m:sub>
+                <m:r>
+                  <m:t>nf</m:t>
+                </m:r>
+              </m:sub>
+            </m:sSub>
+            <m:sSub>
+              <m:sSubPr/>
+              <m:e>
+                <m:r>
+                  <m:t>c</m:t>
+                </m:r>
+              </m:e>
+              <m:sub>
+                <m:r>
+                  <m:t>p,nf</m:t>
+                </m:r>
+              </m:sub>
+            </m:sSub>
+          </m:num>
+          <m:den>
+            <m:sSub>
+              <m:sSubPr/>
+              <m:e>
+                <m:r>
+                  <m:t>k</m:t>
+                </m:r>
+              </m:e>
+              <m:sub>
+                <m:r>
+                  <m:t>nf</m:t>
+                </m:r>
+              </m:sub>
+            </m:sSub>
+          </m:den>
+        </m:f>
+      </m:oMath>
+      <w:r>
+        <w:tab/>
         <w:rPr>
-          <w:i/>
           <w:sz w:val="22"/>
-          <w:szCs w:val="22"/>
         </w:rPr>
-        <w:t xml:space="preserve">Pr = fracmu_nf c_p,nfk_nf      (12)</w:t>
+        <w:t xml:space="preserve">(12)</w:t>
       </w:r>
     </w:p>
     <w:p>
@@ -2207,40 +2943,296 @@
     <w:p>
       <w:pPr>
         <w:jc w:val="center"/>
-      </w:pPr>
-      <w:r>
+        <w:tabs>
+          <w:tab w:val="right" w:pos="9360"/>
+        </w:tabs>
+      </w:pPr>
+      <m:oMath>
+        <m:sSub>
+          <m:sSubPr/>
+          <m:e>
+            <m:acc>
+              <m:accPr>
+                <m:chr m:val="̇"/>
+              </m:accPr>
+              <m:e>
+                <m:r>
+                  <m:t>m</m:t>
+                </m:r>
+              </m:e>
+            </m:acc>
+          </m:e>
+          <m:sub>
+            <m:r>
+              <m:t>nf</m:t>
+            </m:r>
+          </m:sub>
+        </m:sSub>
+        <m:r>
+          <m:t>=</m:t>
+        </m:r>
+        <m:sSub>
+          <m:sSubPr/>
+          <m:e>
+            <m:r>
+              <m:t>ρ</m:t>
+            </m:r>
+          </m:e>
+          <m:sub>
+            <m:r>
+              <m:t>nf</m:t>
+            </m:r>
+          </m:sub>
+        </m:sSub>
+        <m:sSub>
+          <m:sSubPr/>
+          <m:e>
+            <m:acc>
+              <m:accPr>
+                <m:chr m:val="̇"/>
+              </m:accPr>
+              <m:e>
+                <m:r>
+                  <m:t>V</m:t>
+                </m:r>
+              </m:e>
+            </m:acc>
+          </m:e>
+          <m:sub>
+            <m:r>
+              <m:t>nf</m:t>
+            </m:r>
+          </m:sub>
+        </m:sSub>
+      </m:oMath>
+      <w:r>
+        <w:tab/>
         <w:rPr>
-          <w:i/>
           <w:sz w:val="22"/>
-          <w:szCs w:val="22"/>
         </w:rPr>
-        <w:t xml:space="preserve">m_dot_nf = rho_nf dotV_nf      (13)</w:t>
+        <w:t xml:space="preserve">(13)</w:t>
       </w:r>
     </w:p>
     <w:p>
       <w:pPr>
         <w:jc w:val="center"/>
-      </w:pPr>
-      <w:r>
+        <w:tabs>
+          <w:tab w:val="right" w:pos="9360"/>
+        </w:tabs>
+      </w:pPr>
+      <m:oMath>
+        <m:sSub>
+          <m:sSubPr/>
+          <m:e>
+            <m:r>
+              <m:t>Q</m:t>
+            </m:r>
+          </m:e>
+          <m:sub>
+            <m:r>
+              <m:t>c</m:t>
+            </m:r>
+          </m:sub>
+        </m:sSub>
+        <m:r>
+          <m:t>=</m:t>
+        </m:r>
+        <m:sSub>
+          <m:sSubPr/>
+          <m:e>
+            <m:acc>
+              <m:accPr>
+                <m:chr m:val="̇"/>
+              </m:accPr>
+              <m:e>
+                <m:r>
+                  <m:t>m</m:t>
+                </m:r>
+              </m:e>
+            </m:acc>
+          </m:e>
+          <m:sub>
+            <m:r>
+              <m:t>nf</m:t>
+            </m:r>
+          </m:sub>
+        </m:sSub>
+        <m:sSub>
+          <m:sSubPr/>
+          <m:e>
+            <m:r>
+              <m:t>c</m:t>
+            </m:r>
+          </m:e>
+          <m:sub>
+            <m:r>
+              <m:t>p,nf</m:t>
+            </m:r>
+          </m:sub>
+        </m:sSub>
+        <m:sSub>
+          <m:sSubPr/>
+          <m:e>
+            <m:r>
+              <m:t>(</m:t>
+            </m:r>
+            <m:sSub>
+              <m:sSubPr/>
+              <m:e>
+                <m:r>
+                  <m:t>T</m:t>
+                </m:r>
+              </m:e>
+              <m:sub>
+                <m:r>
+                  <m:t>in</m:t>
+                </m:r>
+              </m:sub>
+            </m:sSub>
+            <m:r>
+              <m:t>−</m:t>
+            </m:r>
+            <m:sSub>
+              <m:sSubPr/>
+              <m:e>
+                <m:r>
+                  <m:t>T</m:t>
+                </m:r>
+              </m:e>
+              <m:sub>
+                <m:r>
+                  <m:t>out</m:t>
+                </m:r>
+              </m:sub>
+            </m:sSub>
+            <m:r>
+              <m:t>)</m:t>
+            </m:r>
+          </m:e>
+          <m:sub>
+            <m:r>
+              <m:t>nf</m:t>
+            </m:r>
+          </m:sub>
+        </m:sSub>
+      </m:oMath>
+      <w:r>
+        <w:tab/>
         <w:rPr>
-          <w:i/>
           <w:sz w:val="22"/>
-          <w:szCs w:val="22"/>
         </w:rPr>
-        <w:t xml:space="preserve">Q_c = m_dot_nf c_p,nf (T_in - T_out)_nf      (14)</w:t>
+        <w:t xml:space="preserve">(14)</w:t>
       </w:r>
     </w:p>
     <w:p>
       <w:pPr>
         <w:jc w:val="center"/>
-      </w:pPr>
-      <w:r>
+        <w:tabs>
+          <w:tab w:val="right" w:pos="9360"/>
+        </w:tabs>
+      </w:pPr>
+      <m:oMath>
+        <m:sSub>
+          <m:sSubPr/>
+          <m:e>
+            <m:r>
+              <m:t>Q</m:t>
+            </m:r>
+          </m:e>
+          <m:sub>
+            <m:r>
+              <m:t>a</m:t>
+            </m:r>
+          </m:sub>
+        </m:sSub>
+        <m:r>
+          <m:t>=</m:t>
+        </m:r>
+        <m:sSub>
+          <m:sSubPr/>
+          <m:e>
+            <m:acc>
+              <m:accPr>
+                <m:chr m:val="̇"/>
+              </m:accPr>
+              <m:e>
+                <m:r>
+                  <m:t>m</m:t>
+                </m:r>
+              </m:e>
+            </m:acc>
+          </m:e>
+          <m:sub>
+            <m:r>
+              <m:t>a</m:t>
+            </m:r>
+          </m:sub>
+        </m:sSub>
+        <m:sSub>
+          <m:sSubPr/>
+          <m:e>
+            <m:r>
+              <m:t>c</m:t>
+            </m:r>
+          </m:e>
+          <m:sub>
+            <m:r>
+              <m:t>p,a</m:t>
+            </m:r>
+          </m:sub>
+        </m:sSub>
+        <m:sSub>
+          <m:sSubPr/>
+          <m:e>
+            <m:r>
+              <m:t>(</m:t>
+            </m:r>
+            <m:sSub>
+              <m:sSubPr/>
+              <m:e>
+                <m:r>
+                  <m:t>T</m:t>
+                </m:r>
+              </m:e>
+              <m:sub>
+                <m:r>
+                  <m:t>out</m:t>
+                </m:r>
+              </m:sub>
+            </m:sSub>
+            <m:r>
+              <m:t>−</m:t>
+            </m:r>
+            <m:sSub>
+              <m:sSubPr/>
+              <m:e>
+                <m:r>
+                  <m:t>T</m:t>
+                </m:r>
+              </m:e>
+              <m:sub>
+                <m:r>
+                  <m:t>in</m:t>
+                </m:r>
+              </m:sub>
+            </m:sSub>
+            <m:r>
+              <m:t>)</m:t>
+            </m:r>
+          </m:e>
+          <m:sub>
+            <m:r>
+              <m:t>a</m:t>
+            </m:r>
+          </m:sub>
+        </m:sSub>
+      </m:oMath>
+      <w:r>
+        <w:tab/>
         <w:rPr>
-          <w:i/>
           <w:sz w:val="22"/>
-          <w:szCs w:val="22"/>
         </w:rPr>
-        <w:t xml:space="preserve">Q_a = m_dot_a c_p,a (T_out - T_in)_a      (15)</w:t>
+        <w:t xml:space="preserve">(15)</w:t>
       </w:r>
     </w:p>
     <w:p>
@@ -2251,14 +3243,50 @@
     <w:p>
       <w:pPr>
         <w:jc w:val="center"/>
-      </w:pPr>
-      <w:r>
+        <w:tabs>
+          <w:tab w:val="right" w:pos="9360"/>
+        </w:tabs>
+      </w:pPr>
+      <m:oMath>
+        <m:r>
+          <m:t>Q=</m:t>
+        </m:r>
+        <m:sSub>
+          <m:sSubPr/>
+          <m:e>
+            <m:r>
+              <m:t>Q</m:t>
+            </m:r>
+          </m:e>
+          <m:sub>
+            <m:r>
+              <m:t>c</m:t>
+            </m:r>
+          </m:sub>
+        </m:sSub>
+        <m:r>
+          <m:t>≈</m:t>
+        </m:r>
+        <m:sSub>
+          <m:sSubPr/>
+          <m:e>
+            <m:r>
+              <m:t>Q</m:t>
+            </m:r>
+          </m:e>
+          <m:sub>
+            <m:r>
+              <m:t>a</m:t>
+            </m:r>
+          </m:sub>
+        </m:sSub>
+      </m:oMath>
+      <w:r>
+        <w:tab/>
         <w:rPr>
-          <w:i/>
           <w:sz w:val="22"/>
-          <w:szCs w:val="22"/>
         </w:rPr>
-        <w:t xml:space="preserve">Q = Q_c ~= Q_a      (16)</w:t>
+        <w:t xml:space="preserve">(16)</w:t>
       </w:r>
     </w:p>
     <w:p>
@@ -2269,40 +3297,293 @@
     <w:p>
       <w:pPr>
         <w:jc w:val="center"/>
-      </w:pPr>
-      <w:r>
+        <w:tabs>
+          <w:tab w:val="right" w:pos="9360"/>
+        </w:tabs>
+      </w:pPr>
+      <m:oMath>
+        <m:r>
+          <m:t>Δ</m:t>
+        </m:r>
+        <m:sSub>
+          <m:sSubPr/>
+          <m:e>
+            <m:r>
+              <m:t>T</m:t>
+            </m:r>
+          </m:e>
+          <m:sub>
+            <m:r>
+              <m:t>LMTD</m:t>
+            </m:r>
+          </m:sub>
+        </m:sSub>
+        <m:r>
+          <m:t>=</m:t>
+        </m:r>
+        <m:f>
+          <m:fPr/>
+          <m:num>
+            <m:r>
+              <m:t>(</m:t>
+            </m:r>
+            <m:sSub>
+              <m:sSubPr/>
+              <m:e>
+                <m:r>
+                  <m:t>T</m:t>
+                </m:r>
+              </m:e>
+              <m:sub>
+                <m:r>
+                  <m:t>s</m:t>
+                </m:r>
+              </m:sub>
+            </m:sSub>
+            <m:r>
+              <m:t>−</m:t>
+            </m:r>
+            <m:sSub>
+              <m:sSubPr/>
+              <m:e>
+                <m:r>
+                  <m:t>T</m:t>
+                </m:r>
+              </m:e>
+              <m:sub>
+                <m:r>
+                  <m:t>in,nf</m:t>
+                </m:r>
+              </m:sub>
+            </m:sSub>
+            <m:r>
+              <m:t>)−(</m:t>
+            </m:r>
+            <m:sSub>
+              <m:sSubPr/>
+              <m:e>
+                <m:r>
+                  <m:t>T</m:t>
+                </m:r>
+              </m:e>
+              <m:sub>
+                <m:r>
+                  <m:t>s</m:t>
+                </m:r>
+              </m:sub>
+            </m:sSub>
+            <m:r>
+              <m:t>−</m:t>
+            </m:r>
+            <m:sSub>
+              <m:sSubPr/>
+              <m:e>
+                <m:r>
+                  <m:t>T</m:t>
+                </m:r>
+              </m:e>
+              <m:sub>
+                <m:r>
+                  <m:t>out,nf</m:t>
+                </m:r>
+              </m:sub>
+            </m:sSub>
+            <m:r>
+              <m:t>)</m:t>
+            </m:r>
+          </m:num>
+          <m:den>
+            <m:r>
+              <m:t>ln[(</m:t>
+            </m:r>
+            <m:sSub>
+              <m:sSubPr/>
+              <m:e>
+                <m:r>
+                  <m:t>T</m:t>
+                </m:r>
+              </m:e>
+              <m:sub>
+                <m:r>
+                  <m:t>s</m:t>
+                </m:r>
+              </m:sub>
+            </m:sSub>
+            <m:r>
+              <m:t>−</m:t>
+            </m:r>
+            <m:sSub>
+              <m:sSubPr/>
+              <m:e>
+                <m:r>
+                  <m:t>T</m:t>
+                </m:r>
+              </m:e>
+              <m:sub>
+                <m:r>
+                  <m:t>in,nf</m:t>
+                </m:r>
+              </m:sub>
+            </m:sSub>
+            <m:r>
+              <m:t>)/(</m:t>
+            </m:r>
+            <m:sSub>
+              <m:sSubPr/>
+              <m:e>
+                <m:r>
+                  <m:t>T</m:t>
+                </m:r>
+              </m:e>
+              <m:sub>
+                <m:r>
+                  <m:t>s</m:t>
+                </m:r>
+              </m:sub>
+            </m:sSub>
+            <m:r>
+              <m:t>−</m:t>
+            </m:r>
+            <m:sSub>
+              <m:sSubPr/>
+              <m:e>
+                <m:r>
+                  <m:t>T</m:t>
+                </m:r>
+              </m:e>
+              <m:sub>
+                <m:r>
+                  <m:t>out,nf</m:t>
+                </m:r>
+              </m:sub>
+            </m:sSub>
+            <m:r>
+              <m:t>)]</m:t>
+            </m:r>
+          </m:den>
+        </m:f>
+      </m:oMath>
+      <w:r>
+        <w:tab/>
         <w:rPr>
-          <w:i/>
           <w:sz w:val="22"/>
-          <w:szCs w:val="22"/>
         </w:rPr>
-        <w:t xml:space="preserve">Delta T_LMTD = frac(T_s - T_in,nf) - (T_s - T_out,nf)ln![(T_s - T_in,nf)/(T_s - T_out,nf)]      (17)</w:t>
+        <w:t xml:space="preserve">(17)</w:t>
       </w:r>
     </w:p>
     <w:p>
       <w:pPr>
         <w:jc w:val="center"/>
-      </w:pPr>
-      <w:r>
+        <w:tabs>
+          <w:tab w:val="right" w:pos="9360"/>
+        </w:tabs>
+      </w:pPr>
+      <m:oMath>
+        <m:r>
+          <m:t>h=</m:t>
+        </m:r>
+        <m:f>
+          <m:fPr/>
+          <m:num>
+            <m:r>
+              <m:t>Q</m:t>
+            </m:r>
+          </m:num>
+          <m:den>
+            <m:sSub>
+              <m:sSubPr/>
+              <m:e>
+                <m:r>
+                  <m:t>A</m:t>
+                </m:r>
+              </m:e>
+              <m:sub>
+                <m:r>
+                  <m:t>s</m:t>
+                </m:r>
+              </m:sub>
+            </m:sSub>
+            <m:r>
+              <m:t>Δ</m:t>
+            </m:r>
+            <m:sSub>
+              <m:sSubPr/>
+              <m:e>
+                <m:r>
+                  <m:t>T</m:t>
+                </m:r>
+              </m:e>
+              <m:sub>
+                <m:r>
+                  <m:t>LMTD</m:t>
+                </m:r>
+              </m:sub>
+            </m:sSub>
+          </m:den>
+        </m:f>
+      </m:oMath>
+      <w:r>
+        <w:tab/>
         <w:rPr>
-          <w:i/>
           <w:sz w:val="22"/>
-          <w:szCs w:val="22"/>
         </w:rPr>
-        <w:t xml:space="preserve">h = fracQA_s Delta T_LMTD      (18)</w:t>
+        <w:t xml:space="preserve">(18)</w:t>
       </w:r>
     </w:p>
     <w:p>
       <w:pPr>
         <w:jc w:val="center"/>
-      </w:pPr>
-      <w:r>
+        <w:tabs>
+          <w:tab w:val="right" w:pos="9360"/>
+        </w:tabs>
+      </w:pPr>
+      <m:oMath>
+        <m:r>
+          <m:t>Nu=</m:t>
+        </m:r>
+        <m:f>
+          <m:fPr/>
+          <m:num>
+            <m:r>
+              <m:t>h</m:t>
+            </m:r>
+            <m:sSub>
+              <m:sSubPr/>
+              <m:e>
+                <m:r>
+                  <m:t>D</m:t>
+                </m:r>
+              </m:e>
+              <m:sub>
+                <m:r>
+                  <m:t>h</m:t>
+                </m:r>
+              </m:sub>
+            </m:sSub>
+          </m:num>
+          <m:den>
+            <m:sSub>
+              <m:sSubPr/>
+              <m:e>
+                <m:r>
+                  <m:t>k</m:t>
+                </m:r>
+              </m:e>
+              <m:sub>
+                <m:r>
+                  <m:t>nf</m:t>
+                </m:r>
+              </m:sub>
+            </m:sSub>
+          </m:den>
+        </m:f>
+      </m:oMath>
+      <w:r>
+        <w:tab/>
         <w:rPr>
-          <w:i/>
           <w:sz w:val="22"/>
-          <w:szCs w:val="22"/>
         </w:rPr>
-        <w:t xml:space="preserve">Nu = frach D_hk_nf      (19)</w:t>
+        <w:t xml:space="preserve">(19)</w:t>
       </w:r>
     </w:p>
     <w:p>
@@ -2318,40 +3599,200 @@
     <w:p>
       <w:pPr>
         <w:jc w:val="center"/>
-      </w:pPr>
-      <w:r>
+        <w:tabs>
+          <w:tab w:val="right" w:pos="9360"/>
+        </w:tabs>
+      </w:pPr>
+      <m:oMath>
+        <m:sSub>
+          <m:sSubPr/>
+          <m:e>
+            <m:r>
+              <m:t>C</m:t>
+            </m:r>
+          </m:e>
+          <m:sub>
+            <m:r>
+              <m:t>min</m:t>
+            </m:r>
+          </m:sub>
+        </m:sSub>
+        <m:r>
+          <m:t>=</m:t>
+        </m:r>
+        <m:sSub>
+          <m:sSubPr/>
+          <m:e>
+            <m:r>
+              <m:t>(</m:t>
+            </m:r>
+            <m:acc>
+              <m:accPr>
+                <m:chr m:val="̇"/>
+              </m:accPr>
+              <m:e>
+                <m:r>
+                  <m:t>m</m:t>
+                </m:r>
+              </m:e>
+            </m:acc>
+            <m:sSub>
+              <m:sSubPr/>
+              <m:e>
+                <m:r>
+                  <m:t>c</m:t>
+                </m:r>
+              </m:e>
+              <m:sub>
+                <m:r>
+                  <m:t>p</m:t>
+                </m:r>
+              </m:sub>
+            </m:sSub>
+            <m:r>
+              <m:t>)</m:t>
+            </m:r>
+          </m:e>
+          <m:sub>
+            <m:r>
+              <m:t>min</m:t>
+            </m:r>
+          </m:sub>
+        </m:sSub>
+      </m:oMath>
+      <w:r>
+        <w:tab/>
         <w:rPr>
-          <w:i/>
           <w:sz w:val="22"/>
-          <w:szCs w:val="22"/>
         </w:rPr>
-        <w:t xml:space="preserve">C_min = (m_dot c_p)_min      (20)</w:t>
+        <w:t xml:space="preserve">(20)</w:t>
       </w:r>
     </w:p>
     <w:p>
       <w:pPr>
         <w:jc w:val="center"/>
-      </w:pPr>
-      <w:r>
+        <w:tabs>
+          <w:tab w:val="right" w:pos="9360"/>
+        </w:tabs>
+      </w:pPr>
+      <m:oMath>
+        <m:sSub>
+          <m:sSubPr/>
+          <m:e>
+            <m:r>
+              <m:t>Q</m:t>
+            </m:r>
+          </m:e>
+          <m:sub>
+            <m:r>
+              <m:t>max</m:t>
+            </m:r>
+          </m:sub>
+        </m:sSub>
+        <m:r>
+          <m:t>=</m:t>
+        </m:r>
+        <m:sSub>
+          <m:sSubPr/>
+          <m:e>
+            <m:r>
+              <m:t>C</m:t>
+            </m:r>
+          </m:e>
+          <m:sub>
+            <m:r>
+              <m:t>min</m:t>
+            </m:r>
+          </m:sub>
+        </m:sSub>
+        <m:r>
+          <m:t>(</m:t>
+        </m:r>
+        <m:sSub>
+          <m:sSubPr/>
+          <m:e>
+            <m:r>
+              <m:t>T</m:t>
+            </m:r>
+          </m:e>
+          <m:sub>
+            <m:r>
+              <m:t>in,c</m:t>
+            </m:r>
+          </m:sub>
+        </m:sSub>
+        <m:r>
+          <m:t>−</m:t>
+        </m:r>
+        <m:sSub>
+          <m:sSubPr/>
+          <m:e>
+            <m:r>
+              <m:t>T</m:t>
+            </m:r>
+          </m:e>
+          <m:sub>
+            <m:r>
+              <m:t>in,a</m:t>
+            </m:r>
+          </m:sub>
+        </m:sSub>
+        <m:r>
+          <m:t>)</m:t>
+        </m:r>
+      </m:oMath>
+      <w:r>
+        <w:tab/>
         <w:rPr>
-          <w:i/>
           <w:sz w:val="22"/>
-          <w:szCs w:val="22"/>
         </w:rPr>
-        <w:t xml:space="preserve">Q_max = C_min (T_in,c - T_in,a)      (21)</w:t>
+        <w:t xml:space="preserve">(21)</w:t>
       </w:r>
     </w:p>
     <w:p>
       <w:pPr>
         <w:jc w:val="center"/>
-      </w:pPr>
-      <w:r>
+        <w:tabs>
+          <w:tab w:val="right" w:pos="9360"/>
+        </w:tabs>
+      </w:pPr>
+      <m:oMath>
+        <m:r>
+          <m:t>ε</m:t>
+        </m:r>
+        <m:r>
+          <m:t>=</m:t>
+        </m:r>
+        <m:f>
+          <m:fPr/>
+          <m:num>
+            <m:r>
+              <m:t>Q</m:t>
+            </m:r>
+          </m:num>
+          <m:den>
+            <m:sSub>
+              <m:sSubPr/>
+              <m:e>
+                <m:r>
+                  <m:t>Q</m:t>
+                </m:r>
+              </m:e>
+              <m:sub>
+                <m:r>
+                  <m:t>max</m:t>
+                </m:r>
+              </m:sub>
+            </m:sSub>
+          </m:den>
+        </m:f>
+      </m:oMath>
+      <w:r>
+        <w:tab/>
         <w:rPr>
-          <w:i/>
           <w:sz w:val="22"/>
-          <w:szCs w:val="22"/>
         </w:rPr>
-        <w:t xml:space="preserve">eps = fracQQ_max      (22)</w:t>
+        <w:t xml:space="preserve">(22)</w:t>
       </w:r>
     </w:p>
     <w:p>
@@ -2362,14 +3803,50 @@
     <w:p>
       <w:pPr>
         <w:jc w:val="center"/>
-      </w:pPr>
-      <w:r>
+        <w:tabs>
+          <w:tab w:val="right" w:pos="9360"/>
+        </w:tabs>
+      </w:pPr>
+      <m:oMath>
+        <m:r>
+          <m:t>Nu=a </m:t>
+        </m:r>
+        <m:sSup>
+          <m:sSupPr/>
+          <m:e>
+            <m:r>
+              <m:t>Re</m:t>
+            </m:r>
+          </m:e>
+          <m:sup>
+            <m:r>
+              <m:t>0.5</m:t>
+            </m:r>
+          </m:sup>
+        </m:sSup>
+        <m:r>
+          <m:t> </m:t>
+        </m:r>
+        <m:sSup>
+          <m:sSupPr/>
+          <m:e>
+            <m:r>
+              <m:t>Pr</m:t>
+            </m:r>
+          </m:e>
+          <m:sup>
+            <m:r>
+              <m:t>1/3</m:t>
+            </m:r>
+          </m:sup>
+        </m:sSup>
+      </m:oMath>
+      <w:r>
+        <w:tab/>
         <w:rPr>
-          <w:i/>
           <w:sz w:val="22"/>
-          <w:szCs w:val="22"/>
         </w:rPr>
-        <w:t xml:space="preserve">Nu = a Re^0.5 Pr^1/3      (23)</w:t>
+        <w:t xml:space="preserve">(23)</w:t>
       </w:r>
     </w:p>
     <w:p>
@@ -3181,53 +4658,255 @@
     <w:p>
       <w:pPr>
         <w:jc w:val="center"/>
-      </w:pPr>
-      <w:r>
+        <w:tabs>
+          <w:tab w:val="right" w:pos="9360"/>
+        </w:tabs>
+      </w:pPr>
+      <m:oMath>
+        <m:r>
+          <m:t>r=</m:t>
+        </m:r>
+        <m:f>
+          <m:fPr/>
+          <m:num>
+            <m:r>
+              <m:t>cov(a,p)</m:t>
+            </m:r>
+          </m:num>
+          <m:den>
+            <m:rad>
+              <m:radPr>
+                <m:degHide m:val="1"/>
+              </m:radPr>
+              <m:deg/>
+              <m:e>
+                <m:r>
+                  <m:t>cov(a,a) cov(p,p)</m:t>
+                </m:r>
+              </m:e>
+            </m:rad>
+          </m:den>
+        </m:f>
+      </m:oMath>
+      <w:r>
+        <w:tab/>
         <w:rPr>
-          <w:i/>
           <w:sz w:val="22"/>
-          <w:szCs w:val="22"/>
         </w:rPr>
-        <w:t xml:space="preserve">r = fraccov(a,p)sqrtcov(a,a) cov(p,p)      (24)</w:t>
+        <w:t xml:space="preserve">(24)</w:t>
       </w:r>
     </w:p>
     <w:p>
       <w:pPr>
         <w:jc w:val="center"/>
-      </w:pPr>
-      <w:r>
+        <w:tabs>
+          <w:tab w:val="right" w:pos="9360"/>
+        </w:tabs>
+      </w:pPr>
+      <m:oMath>
+        <m:r>
+          <m:t>MSE=</m:t>
+        </m:r>
+        <m:f>
+          <m:fPr/>
+          <m:num>
+            <m:r>
+              <m:t>1</m:t>
+            </m:r>
+          </m:num>
+          <m:den>
+            <m:r>
+              <m:t>N</m:t>
+            </m:r>
+          </m:den>
+        </m:f>
+        <m:nary>
+          <m:naryPr>
+            <m:chr m:val="∑"/>
+            <m:limLoc m:val="undOvr"/>
+          </m:naryPr>
+          <m:sub>
+            <m:r>
+              <m:t>i=1</m:t>
+            </m:r>
+          </m:sub>
+          <m:sup>
+            <m:r>
+              <m:t>N</m:t>
+            </m:r>
+          </m:sup>
+          <m:e>
+            <m:sSup>
+              <m:sSupPr/>
+              <m:e>
+                <m:r>
+                  <m:t>(</m:t>
+                </m:r>
+                <m:sSub>
+                  <m:sSubPr/>
+                  <m:e>
+                    <m:r>
+                      <m:t>a</m:t>
+                    </m:r>
+                  </m:e>
+                  <m:sub>
+                    <m:r>
+                      <m:t>i</m:t>
+                    </m:r>
+                  </m:sub>
+                </m:sSub>
+                <m:r>
+                  <m:t>−</m:t>
+                </m:r>
+                <m:sSub>
+                  <m:sSubPr/>
+                  <m:e>
+                    <m:r>
+                      <m:t>p</m:t>
+                    </m:r>
+                  </m:e>
+                  <m:sub>
+                    <m:r>
+                      <m:t>i</m:t>
+                    </m:r>
+                  </m:sub>
+                </m:sSub>
+                <m:r>
+                  <m:t>)</m:t>
+                </m:r>
+              </m:e>
+              <m:sup>
+                <m:r>
+                  <m:t>2</m:t>
+                </m:r>
+              </m:sup>
+            </m:sSup>
+          </m:e>
+        </m:nary>
+      </m:oMath>
+      <w:r>
+        <w:tab/>
         <w:rPr>
-          <w:i/>
           <w:sz w:val="22"/>
-          <w:szCs w:val="22"/>
         </w:rPr>
-        <w:t xml:space="preserve">MSE = (1)/(N)SUM[i=1..N](a_i - p_i)^2      (25)</w:t>
+        <w:t xml:space="preserve">(25)</w:t>
       </w:r>
     </w:p>
     <w:p>
       <w:pPr>
         <w:jc w:val="center"/>
-      </w:pPr>
-      <w:r>
+        <w:tabs>
+          <w:tab w:val="right" w:pos="9360"/>
+        </w:tabs>
+      </w:pPr>
+      <m:oMath>
+        <m:r>
+          <m:t>RMSE=</m:t>
+        </m:r>
+        <m:rad>
+          <m:radPr>
+            <m:degHide m:val="1"/>
+          </m:radPr>
+          <m:deg/>
+          <m:e>
+            <m:r>
+              <m:t>MSE</m:t>
+            </m:r>
+          </m:e>
+        </m:rad>
+      </m:oMath>
+      <w:r>
+        <w:tab/>
         <w:rPr>
-          <w:i/>
           <w:sz w:val="22"/>
-          <w:szCs w:val="22"/>
         </w:rPr>
-        <w:t xml:space="preserve">RMSE = sqrt(MSE)      (26)</w:t>
+        <w:t xml:space="preserve">(26)</w:t>
       </w:r>
     </w:p>
     <w:p>
       <w:pPr>
         <w:jc w:val="center"/>
-      </w:pPr>
-      <w:r>
+        <w:tabs>
+          <w:tab w:val="right" w:pos="9360"/>
+        </w:tabs>
+      </w:pPr>
+      <m:oMath>
+        <m:r>
+          <m:t>MAE=</m:t>
+        </m:r>
+        <m:f>
+          <m:fPr/>
+          <m:num>
+            <m:r>
+              <m:t>1</m:t>
+            </m:r>
+          </m:num>
+          <m:den>
+            <m:r>
+              <m:t>N</m:t>
+            </m:r>
+          </m:den>
+        </m:f>
+        <m:nary>
+          <m:naryPr>
+            <m:chr m:val="∑"/>
+            <m:limLoc m:val="undOvr"/>
+          </m:naryPr>
+          <m:sub>
+            <m:r>
+              <m:t>i=1</m:t>
+            </m:r>
+          </m:sub>
+          <m:sup>
+            <m:r>
+              <m:t>N</m:t>
+            </m:r>
+          </m:sup>
+          <m:e>
+            <m:r>
+              <m:t>|</m:t>
+            </m:r>
+            <m:sSub>
+              <m:sSubPr/>
+              <m:e>
+                <m:r>
+                  <m:t>a</m:t>
+                </m:r>
+              </m:e>
+              <m:sub>
+                <m:r>
+                  <m:t>i</m:t>
+                </m:r>
+              </m:sub>
+            </m:sSub>
+            <m:r>
+              <m:t>−</m:t>
+            </m:r>
+            <m:sSub>
+              <m:sSubPr/>
+              <m:e>
+                <m:r>
+                  <m:t>p</m:t>
+                </m:r>
+              </m:e>
+              <m:sub>
+                <m:r>
+                  <m:t>i</m:t>
+                </m:r>
+              </m:sub>
+            </m:sSub>
+            <m:r>
+              <m:t>|</m:t>
+            </m:r>
+          </m:e>
+        </m:nary>
+      </m:oMath>
+      <w:r>
+        <w:tab/>
         <w:rPr>
-          <w:i/>
           <w:sz w:val="22"/>
-          <w:szCs w:val="22"/>
         </w:rPr>
-        <w:t xml:space="preserve">MAE = (1)/(N)SUM[i=1..N]|a_i - p_i|      (27)</w:t>
+        <w:t xml:space="preserve">(27)</w:t>
       </w:r>
     </w:p>
     <w:p>

</xml_diff>